<commit_message>
KP3-O3a-2: Vorlagenfelder gebaeude.ergebnis.*, Katalog v16, Kurzbericht
Neunzehn Einzelfelder gebaeude.ergebnis.* (Nachtauskühl- und
Sommerlüftungsstunden, Zustand, Art, Aufheizzeit, manuelle Aufheizzeit,
T_a,B, P_auf, Quelle, Rampentage, Σ, längste Rampe, W2-/W1-Tage,
Kappungsstunden, Φ_HL, Φ_RH, Auslegungsgröße, Hinweise W1-W5) und der
Datenschalter hat.aufheizung, alle Seit 16. Die im Entwurf geplante
Fassung 12 war vergeben (Strom/Kälte); KATALOGFASSUNG und
KatalogfassungWord 15 -> 16, eingefrorene Liste v16 (20 neue Schlüssel).
Kurzbericht de/en mit Aufheizabsatz je Gebäude (E58 F4 (b)) und zehntem
Kommentar; Wachen nachgezogen. Mitgelieferte Vorlagen über
Berichtsvorlage „alle“ neu erzeugt, OpenXmlValidator 0 Fehler.

Co-Authored-By: Claude Opus 5.5 <noreply@anthropic.com>
Claude-Session: https://claude.ai/code/session_01H9uGe7RdCJxbSxTUPLM6Ta
</commit_message>
<xml_diff>
--- a/WindowsFormsApplication1/Allgemein/Bericht/Vorlagen/Berichtsvorlage_Kurzbericht.docx
+++ b/WindowsFormsApplication1/Allgemein/Bericht/Vorlagen/Berichtsvorlage_Kurzbericht.docx
@@ -777,6 +777,142 @@
     </w:p>
     <w:p>
       <w:pPr>
+        <w:pStyle w:val="Normal"/>
+      </w:pPr>
+      <w:commentRangeStart w:id="9"/>
+      <w:r>
+        <w:rPr>
+          <w:noProof/>
+        </w:rPr>
+        <w:t xml:space="preserve">{{#wenn hat.aufheizung}}</w:t>
+      </w:r>
+      <w:commentRangeEnd w:id="9"/>
+      <w:r>
+        <w:commentReference w:id="9"/>
+      </w:r>
+    </w:p>
+    <w:p>
+      <w:pPr>
+        <w:pStyle w:val="Heading2"/>
+      </w:pPr>
+      <w:r>
+        <w:t xml:space="preserve">Aufheizung</w:t>
+      </w:r>
+    </w:p>
+    <w:p>
+      <w:pPr>
+        <w:pStyle w:val="Normal"/>
+      </w:pPr>
+      <w:r>
+        <w:rPr>
+          <w:noProof/>
+        </w:rPr>
+        <w:t xml:space="preserve">{{#je gebaeude}}</w:t>
+      </w:r>
+    </w:p>
+    <w:p>
+      <w:pPr>
+        <w:pStyle w:val="Normal"/>
+      </w:pPr>
+      <w:r>
+        <w:rPr>
+          <w:noProof/>
+        </w:rPr>
+        <w:t xml:space="preserve">{{gebaeude.name}}</w:t>
+      </w:r>
+      <w:r>
+        <w:t xml:space="preserve">: Die Aufheizzeit beträgt </w:t>
+      </w:r>
+      <w:r>
+        <w:rPr>
+          <w:noProof/>
+        </w:rPr>
+        <w:t xml:space="preserve">{{gebaeude.ergebnis.aufheizzeit}}</w:t>
+      </w:r>
+      <w:r>
+        <w:t xml:space="preserve"> bei </w:t>
+      </w:r>
+      <w:r>
+        <w:rPr>
+          <w:noProof/>
+        </w:rPr>
+        <w:t xml:space="preserve">{{gebaeude.ergebnis.aufheiz_aussentemperatur}}</w:t>
+      </w:r>
+      <w:r>
+        <w:t xml:space="preserve">, die Aufheizleistung </w:t>
+      </w:r>
+      <w:r>
+        <w:rPr>
+          <w:noProof/>
+        </w:rPr>
+        <w:t xml:space="preserve">{{gebaeude.ergebnis.aufheizleistung}}</w:t>
+      </w:r>
+      <w:r>
+        <w:t xml:space="preserve">; die Auslegungsgröße </w:t>
+      </w:r>
+      <w:r>
+        <w:rPr>
+          <w:noProof/>
+        </w:rPr>
+        <w:t xml:space="preserve">{{gebaeude.ergebnis.auslegungsgroesse}}</w:t>
+      </w:r>
+      <w:r>
+        <w:t xml:space="preserve"> setzt sich aus der Auslegungsheizlast </w:t>
+      </w:r>
+      <w:r>
+        <w:rPr>
+          <w:noProof/>
+        </w:rPr>
+        <w:t xml:space="preserve">{{gebaeude.ergebnis.auslegungsheizlast}}</w:t>
+      </w:r>
+      <w:r>
+        <w:t xml:space="preserve"> und dem Aufheizzuschlag </w:t>
+      </w:r>
+      <w:r>
+        <w:rPr>
+          <w:noProof/>
+        </w:rPr>
+        <w:t xml:space="preserve">{{gebaeude.ergebnis.aufheizzuschlag}}</w:t>
+      </w:r>
+      <w:r>
+        <w:t xml:space="preserve"> zusammen.</w:t>
+      </w:r>
+    </w:p>
+    <w:p>
+      <w:pPr>
+        <w:pStyle w:val="Normal"/>
+      </w:pPr>
+      <w:r>
+        <w:rPr>
+          <w:noProof/>
+        </w:rPr>
+        <w:t xml:space="preserve">{{gebaeude.ergebnis.aufheizhinweise}}</w:t>
+      </w:r>
+    </w:p>
+    <w:p>
+      <w:pPr>
+        <w:pStyle w:val="Normal"/>
+      </w:pPr>
+      <w:r>
+        <w:rPr>
+          <w:noProof/>
+        </w:rPr>
+        <w:t xml:space="preserve">{{/je}}</w:t>
+      </w:r>
+    </w:p>
+    <w:p>
+      <w:pPr>
+        <w:pStyle w:val="Normal"/>
+      </w:pPr>
+      <w:r>
+        <w:rPr>
+          <w:noProof/>
+        </w:rPr>
+        <w:t xml:space="preserve">{{/wenn}}</w:t>
+      </w:r>
+    </w:p>
+    <w:p>
+      <w:pPr>
         <w:pStyle w:val="Heading1"/>
       </w:pPr>
       <w:commentRangeStart w:id="6"/>
@@ -1201,6 +1337,21 @@
       </w:r>
       <w:r>
         <w:t xml:space="preserve">Die Mustertabelle mit dem Alternativtext {{muster.tabelle}}: Schattierung und Schrift jeder Zelle gelten für die Zeilen dieser Rolle in allen Strukturtabellen – Stamm, Gruppe, Summe, Warnung. EPOS-Plan liest sie und entfernt sie aus dem Bericht.</w:t>
+      </w:r>
+    </w:p>
+  </w:comment>
+  <w:comment w:initials="EP" w:author="EPOS-Plan" w:id="9">
+    <w:p>
+      <w:r>
+        <w:annotationRef/>
+      </w:r>
+      <w:r>
+        <w:t xml:space="preserve">Ein Absatz je Gebäude, nur mit Aufheizoptimierung: {{#wenn hat.aufheizung}} lässt den Abschnitt entfallen, wenn kein Gebäude mit ihr gerechnet hat; {{#je gebaeude}} … {{/je}} wiederholt den Absatz für jedes Gebäude, etwa „Gebäude 1: Die Aufheizzeit beträgt 4 h bei −10,0 °C …“.</w:t>
+      </w:r>
+    </w:p>
+    <w:p>
+      <w:r>
+        <w:t xml:space="preserve">Die Werte gebaeude.ergebnis.… kommen aus dem Ergebnis des Laufs. Die Auslegungsgröße ist die Auslegungsheizlast plus der Aufheizzuschlag; {{gebaeude.ergebnis.aufheizhinweise}} nennt die Hinweise W1 bis W5 und bleibt ohne Anlass leer.</w:t>
       </w:r>
     </w:p>
   </w:comment>

</xml_diff>

<commit_message>
AH-V6: Kurzbericht mit Vorheizsatz, Vorlagen auf Fassung 19, Protokoll
Kurzbericht je Sprache: Absatz 7b {{#wenn hat.vorheizen}} je Gebaeude; alle zehn mitgelieferten Vorlagen mit Werkzeuge/Berichtsvorlage alle neu gebaut (Validator 0 Fehler, wiederholbar); Rumpfwache nachgezogen; Protokoll AH-V6.

Co-Authored-By: Claude Opus 5.5 <noreply@anthropic.com>
Claude-Session: https://claude.ai/code/session_01X2CX69qnhXXtc6epxnPUv6
</commit_message>
<xml_diff>
--- a/WindowsFormsApplication1/Allgemein/Bericht/Vorlagen/Berichtsvorlage_Kurzbericht.docx
+++ b/WindowsFormsApplication1/Allgemein/Bericht/Vorlagen/Berichtsvorlage_Kurzbericht.docx
@@ -913,6 +913,109 @@
     </w:p>
     <w:p>
       <w:pPr>
+        <w:pStyle w:val="Normal"/>
+      </w:pPr>
+      <w:r>
+        <w:rPr>
+          <w:noProof/>
+        </w:rPr>
+        <w:t xml:space="preserve">{{#wenn hat.vorheizen}}</w:t>
+      </w:r>
+    </w:p>
+    <w:p>
+      <w:pPr>
+        <w:pStyle w:val="Normal"/>
+      </w:pPr>
+      <w:r>
+        <w:rPr>
+          <w:noProof/>
+        </w:rPr>
+        <w:t xml:space="preserve">{{#je gebaeude}}</w:t>
+      </w:r>
+    </w:p>
+    <w:p>
+      <w:pPr>
+        <w:pStyle w:val="Normal"/>
+      </w:pPr>
+      <w:r>
+        <w:rPr>
+          <w:noProof/>
+        </w:rPr>
+        <w:t xml:space="preserve">{{gebaeude.name}}</w:t>
+      </w:r>
+      <w:r>
+        <w:t xml:space="preserve"> – </w:t>
+      </w:r>
+      <w:r>
+        <w:rPr>
+          <w:noProof/>
+        </w:rPr>
+        <w:t xml:space="preserve">{{gebaeude.ergebnis.vorheizverfahren}}</w:t>
+      </w:r>
+      <w:r>
+        <w:t xml:space="preserve">: Vorheizzeit </w:t>
+      </w:r>
+      <w:r>
+        <w:rPr>
+          <w:noProof/>
+        </w:rPr>
+        <w:t xml:space="preserve">{{gebaeude.ergebnis.vorheizzeit}}</w:t>
+      </w:r>
+      <w:r>
+        <w:t xml:space="preserve">, Vorheizleistung </w:t>
+      </w:r>
+      <w:r>
+        <w:rPr>
+          <w:noProof/>
+        </w:rPr>
+        <w:t xml:space="preserve">{{gebaeude.ergebnis.vorheizleistung}}</w:t>
+      </w:r>
+      <w:r>
+        <w:t xml:space="preserve">, Tage ohne Ankunft </w:t>
+      </w:r>
+      <w:r>
+        <w:rPr>
+          <w:noProof/>
+        </w:rPr>
+        <w:t xml:space="preserve">{{gebaeude.ergebnis.vorheiz_tage_verfehlt}}</w:t>
+      </w:r>
+      <w:r>
+        <w:t xml:space="preserve">, Mehrwärme des Vorheizens </w:t>
+      </w:r>
+      <w:r>
+        <w:rPr>
+          <w:noProof/>
+        </w:rPr>
+        <w:t xml:space="preserve">{{gebaeude.ergebnis.vorheiz_mehrwaerme}}</w:t>
+      </w:r>
+      <w:r>
+        <w:t xml:space="preserve">.</w:t>
+      </w:r>
+    </w:p>
+    <w:p>
+      <w:pPr>
+        <w:pStyle w:val="Normal"/>
+      </w:pPr>
+      <w:r>
+        <w:rPr>
+          <w:noProof/>
+        </w:rPr>
+        <w:t xml:space="preserve">{{/je}}</w:t>
+      </w:r>
+    </w:p>
+    <w:p>
+      <w:pPr>
+        <w:pStyle w:val="Normal"/>
+      </w:pPr>
+      <w:r>
+        <w:rPr>
+          <w:noProof/>
+        </w:rPr>
+        <w:t xml:space="preserve">{{/wenn}}</w:t>
+      </w:r>
+    </w:p>
+    <w:p>
+      <w:pPr>
         <w:pStyle w:val="Heading1"/>
       </w:pPr>
       <w:commentRangeStart w:id="6"/>
@@ -1351,7 +1454,7 @@
     </w:p>
     <w:p>
       <w:r>
-        <w:t xml:space="preserve">Die Werte gebaeude.ergebnis.… kommen aus dem Ergebnis des Laufs. Die Auslegungsgröße ist die Auslegungsheizlast plus der Aufheizzuschlag; {{gebaeude.ergebnis.aufheizhinweise}} nennt die Hinweise W1 bis W5 und bleibt ohne Anlass leer.</w:t>
+        <w:t xml:space="preserve">Die Werte gebaeude.ergebnis.… kommen aus dem Ergebnis des Laufs. Die Auslegungsgröße ist die Auslegungsheizlast plus der Aufheizzuschlag; {{gebaeude.ergebnis.aufheizhinweise}} nennt die Hinweise W1 bis W5 und bleibt ohne Anlass leer. Mit vorgegebener oder berechneter Vorheizzeit folgt ({{#wenn hat.vorheizen}}) ein Satz mit Verfahren, Vorheizzeit, Vorheizleistung, Tagen ohne Ankunft und Mehrwärme.</w:t>
       </w:r>
     </w:p>
   </w:comment>

</xml_diff>

<commit_message>
SA3b: Kurzbericht 7b mit Halbsatz, Berichtsvorlagen auf Fassung 21
Absatz 7b endet mit {{gebaeude.ergebnis.vorheiz_schnellaufheizung}}
(leer ohne Wirkung), Kommentar 9 nennt das Feld; Werkzeuge/
Berichtsvorlage alle: zehn Vorlagen auf v21, Validator 0 Fehler,
wiederholbar. Rumpf des Kurzberichts in der Dateiwache nachgezogen.

Co-Authored-By: Claude Opus 5.5 <noreply@anthropic.com>
Claude-Session: https://claude.ai/code/session_01X2CX69qnhXXtc6epxnPUv6
</commit_message>
<xml_diff>
--- a/WindowsFormsApplication1/Allgemein/Bericht/Vorlagen/Berichtsvorlage_Kurzbericht.docx
+++ b/WindowsFormsApplication1/Allgemein/Bericht/Vorlagen/Berichtsvorlage_Kurzbericht.docx
@@ -989,6 +989,12 @@
         <w:t xml:space="preserve">{{gebaeude.ergebnis.vorheiz_mehrwaerme}}</w:t>
       </w:r>
       <w:r>
+        <w:rPr>
+          <w:noProof/>
+        </w:rPr>
+        <w:t xml:space="preserve">{{gebaeude.ergebnis.vorheiz_schnellaufheizung}}</w:t>
+      </w:r>
+      <w:r>
         <w:t xml:space="preserve">.</w:t>
       </w:r>
     </w:p>
@@ -1454,7 +1460,7 @@
     </w:p>
     <w:p>
       <w:r>
-        <w:t xml:space="preserve">Die Werte gebaeude.ergebnis.… kommen aus dem Ergebnis des Laufs. Die Auslegungsgröße ist die Auslegungsheizlast plus der Aufheizzuschlag; {{gebaeude.ergebnis.aufheizhinweise}} nennt die Hinweise W1 bis W5 und bleibt ohne Anlass leer. Mit vorgegebener oder berechneter Vorheizzeit folgt ({{#wenn hat.vorheizen}}) ein Satz mit Verfahren, Vorheizzeit, Vorheizleistung, Tagen ohne Ankunft und Mehrwärme.</w:t>
+        <w:t xml:space="preserve">Die Werte gebaeude.ergebnis.… kommen aus dem Ergebnis des Laufs. Die Auslegungsgröße ist die Auslegungsheizlast plus der Aufheizzuschlag; {{gebaeude.ergebnis.aufheizhinweise}} nennt die Hinweise W1 bis W5 und bleibt ohne Anlass leer. Mit vorgegebener oder berechneter Vorheizzeit folgt ({{#wenn hat.vorheizen}}) ein Satz mit Verfahren, Vorheizzeit, Vorheizleistung, Tagen ohne Ankunft und Mehrwärme; mit wirksamer Schnellaufheizung endet er mit „, mit Schnellaufheizung (+2,0 K)“ ({{gebaeude.ergebnis.vorheiz_schnellaufheizung}}).</w:t>
       </w:r>
     </w:p>
   </w:comment>

</xml_diff>

<commit_message>
Kurzbericht: Split ohne Kälteerzeuger ohne Leerwert (K6d-N)
Neuer Datenschalter hat.kaelte.kaeltefolge (Katalog v23, Kontext Gruppe):
wahr, wenn kaelte.deckungsgrad_kaeltefolge einen Wert hat. Ressourcen
VF_HAT__KAELTE__KAELTEFOLGE in beiden Sprachen, Designer neu erzeugt,
Messlatte v23 um den Schalter erweitert.

Kurzbericht de/en: Blöcke schachteln höchstens zwei Ebenen tief, darum
steht der Block hat.kaelte.dezentral jetzt hinter dem Kälteblock. Darin
mit Kälteerzeuger die Hauptzahl samt „davon Kältefolge“, ohne ihn allein
der Anteil der Split-Geräte. Ohne Split bleibt der Bericht byte-gleich.
Kurzbericht- und Bausteinvorlagen neu erzeugt (Validator 0 Fehler,
wiederholbar).

KurzberichtKaelteDezentralTests um den Fall ohne Kälteerzeuger ergänzt.

Co-Authored-By: Claude Opus 5.5 <noreply@anthropic.com>
Claude-Session: https://claude.ai/code/session_01UNeGChCYZu2EpgFx4P3q1q
</commit_message>
<xml_diff>
--- a/WindowsFormsApplication1/Allgemein/Bericht/Vorlagen/Berichtsvorlage_Kurzbericht.docx
+++ b/WindowsFormsApplication1/Allgemein/Bericht/Vorlagen/Berichtsvorlage_Kurzbericht.docx
@@ -794,6 +794,17 @@
         <w:rPr>
           <w:noProof/>
         </w:rPr>
+        <w:t xml:space="preserve">{{/wenn}}</w:t>
+      </w:r>
+    </w:p>
+    <w:p>
+      <w:pPr>
+        <w:pStyle w:val="Normal"/>
+      </w:pPr>
+      <w:r>
+        <w:rPr>
+          <w:noProof/>
+        </w:rPr>
         <w:t xml:space="preserve">{{#wenn hat.kaelte.dezentral}}</w:t>
       </w:r>
     </w:p>
@@ -802,6 +813,17 @@
         <w:pStyle w:val="Normal"/>
       </w:pPr>
       <w:r>
+        <w:rPr>
+          <w:noProof/>
+        </w:rPr>
+        <w:t xml:space="preserve">{{#wenn hat.kaelte.kaeltefolge}}</w:t>
+      </w:r>
+    </w:p>
+    <w:p>
+      <w:pPr>
+        <w:pStyle w:val="Normal"/>
+      </w:pPr>
+      <w:r>
         <w:t xml:space="preserve">Der Kältebedarf beträgt </w:t>
       </w:r>
       <w:r>
@@ -830,6 +852,54 @@
       </w:r>
       <w:r>
         <w:t xml:space="preserve"> des zentral zu deckenden Kältebedarfs.</w:t>
+      </w:r>
+    </w:p>
+    <w:p>
+      <w:pPr>
+        <w:pStyle w:val="Normal"/>
+      </w:pPr>
+      <w:r>
+        <w:rPr>
+          <w:noProof/>
+        </w:rPr>
+        <w:t xml:space="preserve">{{/wenn}}</w:t>
+      </w:r>
+    </w:p>
+    <w:p>
+      <w:pPr>
+        <w:pStyle w:val="Normal"/>
+      </w:pPr>
+      <w:r>
+        <w:rPr>
+          <w:noProof/>
+        </w:rPr>
+        <w:t xml:space="preserve">{{#wenn nicht hat.kaelte.kaeltefolge}}</w:t>
+      </w:r>
+    </w:p>
+    <w:p>
+      <w:pPr>
+        <w:pStyle w:val="Normal"/>
+      </w:pPr>
+      <w:r>
+        <w:t xml:space="preserve">Der Kältebedarf beträgt </w:t>
+      </w:r>
+      <w:r>
+        <w:rPr>
+          <w:noProof/>
+        </w:rPr>
+        <w:t xml:space="preserve">{{stamm.kennzahl.kaelte.jahresbedarf}}</w:t>
+      </w:r>
+      <w:r>
+        <w:t xml:space="preserve">; davon decken die dezentralen Split-Geräte </w:t>
+      </w:r>
+      <w:r>
+        <w:rPr>
+          <w:noProof/>
+        </w:rPr>
+        <w:t xml:space="preserve">{{stamm.kennzahl.kaelte.deckungsgrad_gesamt}}</w:t>
+      </w:r>
+      <w:r>
+        <w:t xml:space="preserve">.</w:t>
       </w:r>
     </w:p>
     <w:p>
@@ -1494,7 +1564,7 @@
     </w:p>
     <w:p>
       <w:r>
-        <w:t xml:space="preserve">Darin wählen {{#wenn nicht hat.kaelte.dezentral}} und {{#wenn hat.kaelte.dezentral}} den Satz: Deckt eine Kältebedarfszeile dezentral über Split-Geräte, nennt er den Deckungsgrad samt Split-Geräten und davon den Anteil der Kältefolge.</w:t>
+        <w:t xml:space="preserve">Darin steht der Satz ohne dezentrale Deckung ({{#wenn nicht hat.kaelte.dezentral}}). Deckt eine Kältebedarfszeile dezentral über Split-Geräte, nennt der Block {{#wenn hat.kaelte.dezentral}} dahinter den Deckungsgrad samt Split-Geräten und mit {{#wenn hat.kaelte.kaeltefolge}} den Anteil der Kältefolge, ohne Kälteerzeuger ({{#wenn nicht hat.kaelte.kaeltefolge}}) allein den Anteil der Split-Geräte. Blöcke lassen sich höchstens zwei Ebenen tief schachteln.</w:t>
       </w:r>
     </w:p>
   </w:comment>

</xml_diff>